<commit_message>
feat(eda_teaching_pack): 기법-목적 매핑 + 통계 검증 + 심화 분석(PCA/트리) 추가
- 각 문항에 "왜 이 기법을 쓰는가" 목적 태그 명시
- 기법-목적 매핑표 추가 (Q1~Q10 + 심화 2문항)
- 분포 진단(skewness, Q-Q plot, Shapiro-Wilk) Q1에 추가
- 가설 검정(Mann-Whitney U) + 효과 크기(Cohen's d) Q4/Q6에 추가
- 상관 유의성(p-value) + 다중공선성 체크 Q9에 추가
- 심화 A: PCA 차원 축소 (표준화 → 설명분산 → 로딩 해석)
- 심화 B: DecisionTree 변수 중요도 (상관 순위 vs 트리 순위 비교)
- deprecated fillna(method="ffill") → df.ffill() 수정
- requirements.txt에 scipy, scikit-learn 추가
- 전 문서(assignment, concept_cards, rubric, expected_output,
  instructor_guide, starter.ipynb, publish 3종) 일관 반영

Co-Authored-By: Claude Opus 4.6 <noreply@anthropic.com>
</commit_message>
<xml_diff>
--- a/eda_teaching_pack/publish/docx/01_problem_sheet_draft.docx
+++ b/eda_teaching_pack/publish/docx/01_problem_sheet_draft.docx
@@ -83,7 +83,7 @@
         <w:pStyle w:val="Heading3"/>
       </w:pPr>
       <w:r>
-        <w:t>Q1. 데이터 스키마 점검</w:t>
+        <w:t>Q1. 데이터 스키마 점검 + 분포 진단</w:t>
       </w:r>
     </w:p>
     <w:p>
@@ -92,6 +92,22 @@
       </w:pPr>
       <w:r>
         <w:t>변수 타입, 행/열 수, 기초 통계량을 정리한다.</w:t>
+      </w:r>
+    </w:p>
+    <w:p>
+      <w:pPr>
+        <w:pStyle w:val="ListBullet"/>
+      </w:pPr>
+      <w:r>
+        <w:t>타깃 변수의 skewness, kurtosis를 보고하고 Q-Q plot을 그린다.</w:t>
+      </w:r>
+    </w:p>
+    <w:p>
+      <w:pPr>
+        <w:pStyle w:val="ListBullet"/>
+      </w:pPr>
+      <w:r>
+        <w:t>정규성 검정(Shapiro-Wilk)을 수행하여 후속 검정 방법 선택의 근거를 마련한다.</w:t>
       </w:r>
     </w:p>
     <w:p/>
@@ -169,6 +185,22 @@
         <w:t>**주의**: drop 적용 시 손실 행 수와 손실 비율을 반드시 보고한다.</w:t>
       </w:r>
     </w:p>
+    <w:p>
+      <w:pPr>
+        <w:pStyle w:val="ListBullet"/>
+      </w:pPr>
+      <w:r>
+        <w:t>**가설 검정**: 처리 전/후 분포 차이에 대해 통계 검정(t-test 또는 Mann-Whitney U)을 수행한다.</w:t>
+      </w:r>
+    </w:p>
+    <w:p>
+      <w:pPr>
+        <w:pStyle w:val="ListBullet"/>
+      </w:pPr>
+      <w:r>
+        <w:t>**효과 크기**: Cohen's d를 함께 보고한다.</w:t>
+      </w:r>
+    </w:p>
     <w:p/>
     <w:p>
       <w:pPr>
@@ -222,6 +254,14 @@
       </w:pPr>
       <w:r>
         <w:t>`remove`와 `cap`을 각각 적용하고 통계량 변화를 비교한다.</w:t>
+      </w:r>
+    </w:p>
+    <w:p>
+      <w:pPr>
+        <w:pStyle w:val="ListBullet"/>
+      </w:pPr>
+      <w:r>
+        <w:t>가설 검정 + Cohen's d를 함께 보고한다.</w:t>
       </w:r>
     </w:p>
     <w:p/>
@@ -288,7 +328,7 @@
         <w:pStyle w:val="ListBullet"/>
       </w:pPr>
       <w:r>
-        <w:t>상관/산점도 기반으로 해석한다.</w:t>
+        <w:t>상관/산점도 기반으로 해석하며, 각 상관계수에 p-value를 함께 보고한다.</w:t>
       </w:r>
     </w:p>
     <w:p/>
@@ -396,6 +436,22 @@
       </w:pPr>
       <w:r>
         <w:t>IQR(또는 표준편차) 변화</w:t>
+      </w:r>
+    </w:p>
+    <w:p>
+      <w:pPr>
+        <w:pStyle w:val="ListNumber"/>
+      </w:pPr>
+      <w:r>
+        <w:t>전/후 비교에는 가설 검정(p-value)과 효과 크기(Cohen's d)를 함께 보고한다.</w:t>
+      </w:r>
+    </w:p>
+    <w:p>
+      <w:pPr>
+        <w:pStyle w:val="ListNumber"/>
+      </w:pPr>
+      <w:r>
+        <w:t>상관계수에는 유의성(p-value)을 함께 표기한다.</w:t>
       </w:r>
     </w:p>
     <w:sectPr>

</xml_diff>